<commit_message>
Fill in author information on title page and cover letter
Co-Authored-By: Claude Sonnet 5.5 <noreply@anthropic.com>
Claude-Session: https://claude.ai/code/session_01BZjJPdbxvnVxMrcgFoYMCh
</commit_message>
<xml_diff>
--- a/isr_submission/Cover_Letter.docx
+++ b/isr_submission/Cover_Letter.docx
@@ -423,7 +423,7 @@
           <w:b w:val="0"/>
           <w:i w:val="0"/>
         </w:rPr>
-        <w:t>[Author 1 name]</w:t>
+        <w:t>Ook Lee</w:t>
       </w:r>
     </w:p>
     <w:p>
@@ -435,7 +435,19 @@
           <w:b w:val="0"/>
           <w:i w:val="0"/>
         </w:rPr>
-        <w:t>[On behalf of all authors]</w:t>
+        <w:t>Department of Information System, Hanyang University, Seoul, Korea</w:t>
+      </w:r>
+    </w:p>
+    <w:p>
+      <w:pPr>
+        <w:spacing w:after="0" w:before="0"/>
+      </w:pPr>
+      <w:r>
+        <w:rPr>
+          <w:b w:val="0"/>
+          <w:i w:val="0"/>
+        </w:rPr>
+        <w:t>ooklee@hanyang.ac.kr</w:t>
       </w:r>
     </w:p>
     <w:sectPr>

</xml_diff>

<commit_message>
Remove literature-search disclaimers from manuscript and cover letter
Co-Authored-By: Claude Sonnet 5.5 <noreply@anthropic.com>
Claude-Session: https://claude.ai/code/session_01BZjJPdbxvnVxMrcgFoYMCh
</commit_message>
<xml_diff>
--- a/isr_submission/Cover_Letter.docx
+++ b/isr_submission/Cover_Letter.docx
@@ -310,19 +310,6 @@
           <w:i w:val="0"/>
         </w:rPr>
         <w:t>Most results are proved. The kink result (Proposition 7) is proved under a stated condition and for lognormal stakes, and the global maximum behind the bunching result (Proposition 8) is verified numerically, not proved. These distinctions are marked in the text and in Table A1 of the Online Appendix.</w:t>
-      </w:r>
-    </w:p>
-    <w:p>
-      <w:pPr>
-        <w:pStyle w:val="ListBullet"/>
-        <w:spacing w:line="276" w:lineRule="auto"/>
-      </w:pPr>
-      <w:r>
-        <w:rPr>
-          <w:b w:val="0"/>
-          <w:i w:val="0"/>
-        </w:rPr>
-        <w:t>Our claims of novelty are limited to the literature we reviewed, which includes recent working papers on AI pricing, signaling, and adoption and the IS and operations literature on software testing. We have not completed a systematic search of the published literature.</w:t>
       </w:r>
     </w:p>
     <w:p>

</xml_diff>